<commit_message>
Update thesis chapters, code documentation, governance, and catalog scripts
</commit_message>
<xml_diff>
--- a/claude/code_docs/CODE_DOC_technical_FA.docx
+++ b/claude/code_docs/CODE_DOC_technical_FA.docx
@@ -2,7 +2,7 @@
 <file path=word/document.xml><?xml version="1.0" encoding="utf-8"?>
 <w:document xmlns:w="http://schemas.openxmlformats.org/wordprocessingml/2006/main" xmlns:m="http://schemas.openxmlformats.org/officeDocument/2006/math" xmlns:r="http://schemas.openxmlformats.org/officeDocument/2006/relationships" xmlns:o="urn:schemas-microsoft-com:office:office" xmlns:v="urn:schemas-microsoft-com:vml" xmlns:w10="urn:schemas-microsoft-com:office:word" xmlns:a="http://schemas.openxmlformats.org/drawingml/2006/main" xmlns:pic="http://schemas.openxmlformats.org/drawingml/2006/picture" xmlns:wp="http://schemas.openxmlformats.org/drawingml/2006/wordprocessingDrawing">
   <w:body>
-    <w:bookmarkStart w:id="23" w:name="شرح-فنی-حلگر-ساختار-درونی-کد"/>
+    <w:bookmarkStart w:id="24" w:name="شرح-فنی-حلگر-ساختار-درونی-کد"/>
     <w:p>
       <w:pPr>
         <w:pStyle w:val="Heading1"/>
@@ -36,55 +36,79 @@
           <w:rStyle w:val="VerbatimChar"/>
           <w:rtl/>
         </w:rPr>
-        <w:t xml:space="preserve">claude_R6.m</w:t>
-      </w:r>
-      <w:r>
-        <w:rPr>
-          <w:rtl/>
-        </w:rPr>
-        <w:t xml:space="preserve"> </w:t>
-      </w:r>
-      <w:r>
-        <w:rPr>
-          <w:rtl/>
-        </w:rPr>
-        <w:t xml:space="preserve">را برای نگه‌داری و توسعهٔ آینده شرح</w:t>
-      </w:r>
-      <w:r>
-        <w:rPr>
-          <w:rtl/>
-        </w:rPr>
-        <w:t xml:space="preserve"> </w:t>
-      </w:r>
-      <w:r>
-        <w:rPr>
-          <w:rtl/>
-        </w:rPr>
-        <w:t xml:space="preserve">می‌دهد، به‌گونه‌ای که خواننده‌ای بدون پیش‌زمینه بتواند بخش‌ها، نحوهٔ کار و</w:t>
-      </w:r>
-      <w:r>
-        <w:rPr>
-          <w:rtl/>
-        </w:rPr>
-        <w:t xml:space="preserve"> </w:t>
-      </w:r>
-      <w:r>
-        <w:rPr>
-          <w:rtl/>
-        </w:rPr>
-        <w:t xml:space="preserve">عملکرد هر قسمت را دریابد. برای اجرای عملی به سند «دستورالعمل کاربری» و برای</w:t>
-      </w:r>
-      <w:r>
-        <w:rPr>
-          <w:rtl/>
-        </w:rPr>
-        <w:t xml:space="preserve"> </w:t>
-      </w:r>
-      <w:r>
-        <w:rPr>
-          <w:rtl/>
-        </w:rPr>
-        <w:t xml:space="preserve">روش نیومارک به «پیوست الف» مراجعه شود.</w:t>
+        <w:t xml:space="preserve">claude_R8.m</w:t>
+      </w:r>
+      <w:r>
+        <w:rPr>
+          <w:rtl/>
+        </w:rPr>
+        <w:t xml:space="preserve"> </w:t>
+      </w:r>
+      <w:r>
+        <w:rPr>
+          <w:rtl/>
+        </w:rPr>
+        <w:t xml:space="preserve">(آخرین/نهاییِ نسخه) را برای نگه‌داری و توسعهٔ</w:t>
+      </w:r>
+      <w:r>
+        <w:rPr>
+          <w:rtl/>
+        </w:rPr>
+        <w:t xml:space="preserve"> </w:t>
+      </w:r>
+      <w:r>
+        <w:rPr>
+          <w:rtl/>
+        </w:rPr>
+        <w:t xml:space="preserve">آینده شرح می‌دهد، به‌گونه‌ای که خواننده‌ای بدون پیش‌زمینه بتواند بخش‌ها، نحوهٔ کار</w:t>
+      </w:r>
+      <w:r>
+        <w:rPr>
+          <w:rtl/>
+        </w:rPr>
+        <w:t xml:space="preserve"> </w:t>
+      </w:r>
+      <w:r>
+        <w:rPr>
+          <w:rtl/>
+        </w:rPr>
+        <w:t xml:space="preserve">و عملکرد هر قسمت را دریابد. نسخهٔ R8 از نظر فیزیک با R7 (و R6) رقم‌به‌رقم یکسان است؛</w:t>
+      </w:r>
+      <w:r>
+        <w:rPr>
+          <w:rtl/>
+        </w:rPr>
+        <w:t xml:space="preserve"> </w:t>
+      </w:r>
+      <w:r>
+        <w:rPr>
+          <w:rtl/>
+        </w:rPr>
+        <w:t xml:space="preserve">تنها تفاوتِ آن تنظیمِ مقادیرِ پیش‌فرضِ پیکربندی به حالتِ مرجعِ رساله است. نسخهٔ R7</w:t>
+      </w:r>
+      <w:r>
+        <w:rPr>
+          <w:rtl/>
+        </w:rPr>
+        <w:t xml:space="preserve"> </w:t>
+      </w:r>
+      <w:r>
+        <w:rPr>
+          <w:rtl/>
+        </w:rPr>
+        <w:t xml:space="preserve">اشیای صریحِ شماره‌دهی/نگاشتِ درجات آزادی را افزوده بود (بخش ۶). برای اجرای عملی به سند</w:t>
+      </w:r>
+      <w:r>
+        <w:rPr>
+          <w:rtl/>
+        </w:rPr>
+        <w:t xml:space="preserve"> </w:t>
+      </w:r>
+      <w:r>
+        <w:rPr>
+          <w:rtl/>
+        </w:rPr>
+        <w:t xml:space="preserve">«دستورالعمل کاربری» و برای روش نیومارک به «پیوست الف» مراجعه شود.</w:t>
       </w:r>
     </w:p>
     <w:bookmarkStart w:id="9" w:name="کلیات-و-معماری"/>
@@ -256,7 +280,7 @@
         <w:rPr>
           <w:rtl/>
         </w:rPr>
-        <w:t xml:space="preserve">فایل به هفت بخش و یک مجموعه تابع کمکی سازمان یافته است:</w:t>
+        <w:t xml:space="preserve">فایل به یک بخشِ پیکربندی (۰) و هفت بخشِ کاری (۱ تا ۷) و یک مجموعه تابع کمکی سازمان یافته است:</w:t>
       </w:r>
     </w:p>
     <w:tbl>
@@ -2230,6 +2254,601 @@
           <w:bCs/>
           <w:rtl/>
         </w:rPr>
+        <w:t xml:space="preserve">سازنده‌ها:</w:t>
+      </w:r>
+      <w:r>
+        <w:rPr>
+          <w:rtl/>
+        </w:rPr>
+        <w:t xml:space="preserve"> </w:t>
+      </w:r>
+      <w:r>
+        <w:rPr>
+          <w:rtl/>
+        </w:rPr>
+        <w:t xml:space="preserve">زمینهٔ</w:t>
+      </w:r>
+      <w:r>
+        <w:rPr>
+          <w:rtl/>
+        </w:rPr>
+        <w:t xml:space="preserve"> </w:t>
+      </w:r>
+      <w:r>
+        <w:rPr>
+          <w:b/>
+          <w:bCs/>
+          <w:rtl/>
+        </w:rPr>
+        <w:t xml:space="preserve">پلیمری (اپوکسی)</w:t>
+      </w:r>
+      <w:r>
+        <w:rPr>
+          <w:rtl/>
+        </w:rPr>
+        <w:t xml:space="preserve"> </w:t>
+      </w:r>
+      <w:r>
+        <w:rPr>
+          <w:rtl/>
+        </w:rPr>
+        <w:t xml:space="preserve">با</w:t>
+      </w:r>
+      <w:r>
+        <w:rPr>
+          <w:rtl/>
+        </w:rPr>
+        <w:t xml:space="preserve"> </w:t>
+      </w:r>
+      <m:oMath>
+        <m:sSub>
+          <m:e>
+            <m:r>
+              <m:t>E</m:t>
+            </m:r>
+          </m:e>
+          <m:sub>
+            <m:r>
+              <m:t>m</m:t>
+            </m:r>
+          </m:sub>
+        </m:sSub>
+        <m:r>
+          <m:rPr>
+            <m:sty m:val="p"/>
+          </m:rPr>
+          <m:t>=</m:t>
+        </m:r>
+        <m:r>
+          <m:t>3</m:t>
+        </m:r>
+        <m:r>
+          <m:rPr>
+            <m:sty m:val="p"/>
+          </m:rPr>
+          <m:t>.</m:t>
+        </m:r>
+        <m:r>
+          <m:t>0</m:t>
+        </m:r>
+      </m:oMath>
+      <w:r>
+        <w:rPr>
+          <w:rtl/>
+        </w:rPr>
+        <w:t xml:space="preserve"> </w:t>
+      </w:r>
+      <w:r>
+        <w:rPr>
+          <w:rtl/>
+        </w:rPr>
+        <w:t xml:space="preserve">GPa،</w:t>
+      </w:r>
+      <w:r>
+        <w:rPr>
+          <w:rtl/>
+        </w:rPr>
+        <w:t xml:space="preserve"> </w:t>
+      </w:r>
+      <m:oMath>
+        <m:r>
+          <m:t>ν</m:t>
+        </m:r>
+        <m:r>
+          <m:rPr>
+            <m:sty m:val="p"/>
+          </m:rPr>
+          <m:t>=</m:t>
+        </m:r>
+        <m:r>
+          <m:t>0</m:t>
+        </m:r>
+        <m:r>
+          <m:rPr>
+            <m:sty m:val="p"/>
+          </m:rPr>
+          <m:t>.</m:t>
+        </m:r>
+        <m:r>
+          <m:t>34</m:t>
+        </m:r>
+      </m:oMath>
+      <w:r>
+        <w:rPr>
+          <w:rtl/>
+        </w:rPr>
+        <w:t xml:space="preserve">،</w:t>
+      </w:r>
+      <w:r>
+        <w:rPr>
+          <w:rtl/>
+        </w:rPr>
+        <w:t xml:space="preserve"> </w:t>
+      </w:r>
+      <m:oMath>
+        <m:r>
+          <m:t>ρ</m:t>
+        </m:r>
+        <m:r>
+          <m:rPr>
+            <m:sty m:val="p"/>
+          </m:rPr>
+          <m:t>=</m:t>
+        </m:r>
+        <m:r>
+          <m:t>1200</m:t>
+        </m:r>
+      </m:oMath>
+      <w:r>
+        <w:rPr>
+          <w:rtl/>
+        </w:rPr>
+        <w:t xml:space="preserve">،</w:t>
+      </w:r>
+      <w:r>
+        <w:rPr>
+          <w:rtl/>
+        </w:rPr>
+        <w:t xml:space="preserve"> </w:t>
+      </w:r>
+      <m:oMath>
+        <m:r>
+          <m:t>c</m:t>
+        </m:r>
+        <m:r>
+          <m:rPr>
+            <m:sty m:val="p"/>
+          </m:rPr>
+          <m:t>=</m:t>
+        </m:r>
+        <m:r>
+          <m:t>1110</m:t>
+        </m:r>
+      </m:oMath>
+      <w:r>
+        <w:rPr>
+          <w:rtl/>
+        </w:rPr>
+        <w:t xml:space="preserve">،</w:t>
+      </w:r>
+      <w:r>
+        <w:rPr>
+          <w:rtl/>
+        </w:rPr>
+        <w:t xml:space="preserve"> </w:t>
+      </w:r>
+      <m:oMath>
+        <m:r>
+          <m:t>k</m:t>
+        </m:r>
+        <m:r>
+          <m:rPr>
+            <m:sty m:val="p"/>
+          </m:rPr>
+          <m:t>=</m:t>
+        </m:r>
+        <m:r>
+          <m:t>0</m:t>
+        </m:r>
+        <m:r>
+          <m:rPr>
+            <m:sty m:val="p"/>
+          </m:rPr>
+          <m:t>.</m:t>
+        </m:r>
+        <m:r>
+          <m:t>246</m:t>
+        </m:r>
+      </m:oMath>
+      <w:r>
+        <w:rPr>
+          <w:rtl/>
+        </w:rPr>
+        <w:t xml:space="preserve">،</w:t>
+      </w:r>
+      <w:r>
+        <w:rPr>
+          <w:rtl/>
+        </w:rPr>
+        <w:t xml:space="preserve"> </w:t>
+      </w:r>
+      <m:oMath>
+        <m:r>
+          <m:t>α</m:t>
+        </m:r>
+        <m:r>
+          <m:rPr>
+            <m:sty m:val="p"/>
+          </m:rPr>
+          <m:t>=</m:t>
+        </m:r>
+        <m:r>
+          <m:t>60</m:t>
+        </m:r>
+        <m:r>
+          <m:rPr>
+            <m:sty m:val="p"/>
+          </m:rPr>
+          <m:t>×</m:t>
+        </m:r>
+        <m:sSup>
+          <m:e>
+            <m:r>
+              <m:t>10</m:t>
+            </m:r>
+          </m:e>
+          <m:sup>
+            <m:r>
+              <m:rPr>
+                <m:sty m:val="p"/>
+              </m:rPr>
+              <m:t>−</m:t>
+            </m:r>
+            <m:r>
+              <m:t>6</m:t>
+            </m:r>
+          </m:sup>
+        </m:sSup>
+      </m:oMath>
+      <w:r>
+        <w:rPr>
+          <w:rtl/>
+        </w:rPr>
+        <w:t xml:space="preserve">؛ و پلاکتِ گرافن (GPL)</w:t>
+      </w:r>
+      <w:r>
+        <w:rPr>
+          <w:rtl/>
+        </w:rPr>
+        <w:t xml:space="preserve"> </w:t>
+      </w:r>
+      <w:r>
+        <w:rPr>
+          <w:rtl/>
+        </w:rPr>
+        <w:t xml:space="preserve">با</w:t>
+      </w:r>
+      <w:r>
+        <w:rPr>
+          <w:rtl/>
+        </w:rPr>
+        <w:t xml:space="preserve"> </w:t>
+      </w:r>
+      <m:oMath>
+        <m:r>
+          <m:t>E</m:t>
+        </m:r>
+        <m:r>
+          <m:rPr>
+            <m:sty m:val="p"/>
+          </m:rPr>
+          <m:t>=</m:t>
+        </m:r>
+        <m:r>
+          <m:t>1010</m:t>
+        </m:r>
+      </m:oMath>
+      <w:r>
+        <w:rPr>
+          <w:rtl/>
+        </w:rPr>
+        <w:t xml:space="preserve"> </w:t>
+      </w:r>
+      <w:r>
+        <w:rPr>
+          <w:rtl/>
+        </w:rPr>
+        <w:t xml:space="preserve">GPa،</w:t>
+      </w:r>
+      <w:r>
+        <w:rPr>
+          <w:rtl/>
+        </w:rPr>
+        <w:t xml:space="preserve"> </w:t>
+      </w:r>
+      <m:oMath>
+        <m:r>
+          <m:t>ρ</m:t>
+        </m:r>
+        <m:r>
+          <m:rPr>
+            <m:sty m:val="p"/>
+          </m:rPr>
+          <m:t>=</m:t>
+        </m:r>
+        <m:r>
+          <m:t>1062</m:t>
+        </m:r>
+        <m:r>
+          <m:rPr>
+            <m:sty m:val="p"/>
+          </m:rPr>
+          <m:t>.</m:t>
+        </m:r>
+        <m:r>
+          <m:t>5</m:t>
+        </m:r>
+      </m:oMath>
+      <w:r>
+        <w:rPr>
+          <w:rtl/>
+        </w:rPr>
+        <w:t xml:space="preserve">،</w:t>
+      </w:r>
+      <w:r>
+        <w:rPr>
+          <w:rtl/>
+        </w:rPr>
+        <w:t xml:space="preserve"> </w:t>
+      </w:r>
+      <m:oMath>
+        <m:r>
+          <m:t>ν</m:t>
+        </m:r>
+        <m:r>
+          <m:rPr>
+            <m:sty m:val="p"/>
+          </m:rPr>
+          <m:t>=</m:t>
+        </m:r>
+        <m:r>
+          <m:t>0</m:t>
+        </m:r>
+        <m:r>
+          <m:rPr>
+            <m:sty m:val="p"/>
+          </m:rPr>
+          <m:t>.</m:t>
+        </m:r>
+        <m:r>
+          <m:t>186</m:t>
+        </m:r>
+      </m:oMath>
+      <w:r>
+        <w:rPr>
+          <w:rtl/>
+        </w:rPr>
+        <w:t xml:space="preserve">،</w:t>
+      </w:r>
+      <w:r>
+        <w:rPr>
+          <w:rtl/>
+        </w:rPr>
+        <w:t xml:space="preserve"> </w:t>
+      </w:r>
+      <m:oMath>
+        <m:r>
+          <m:t>k</m:t>
+        </m:r>
+        <m:r>
+          <m:rPr>
+            <m:sty m:val="p"/>
+          </m:rPr>
+          <m:t>=</m:t>
+        </m:r>
+        <m:r>
+          <m:t>3000</m:t>
+        </m:r>
+      </m:oMath>
+      <w:r>
+        <w:rPr>
+          <w:rtl/>
+        </w:rPr>
+        <w:t xml:space="preserve">،</w:t>
+      </w:r>
+      <w:r>
+        <w:rPr>
+          <w:rtl/>
+        </w:rPr>
+        <w:t xml:space="preserve"> </w:t>
+      </w:r>
+      <m:oMath>
+        <m:r>
+          <m:t>c</m:t>
+        </m:r>
+        <m:r>
+          <m:rPr>
+            <m:sty m:val="p"/>
+          </m:rPr>
+          <m:t>=</m:t>
+        </m:r>
+        <m:r>
+          <m:t>644</m:t>
+        </m:r>
+      </m:oMath>
+      <w:r>
+        <w:rPr>
+          <w:rtl/>
+        </w:rPr>
+        <w:t xml:space="preserve">،</w:t>
+      </w:r>
+      <w:r>
+        <w:rPr>
+          <w:rtl/>
+        </w:rPr>
+        <w:t xml:space="preserve"> </w:t>
+      </w:r>
+      <m:oMath>
+        <m:r>
+          <m:t>α</m:t>
+        </m:r>
+        <m:r>
+          <m:rPr>
+            <m:sty m:val="p"/>
+          </m:rPr>
+          <m:t>=</m:t>
+        </m:r>
+        <m:r>
+          <m:t>5</m:t>
+        </m:r>
+        <m:r>
+          <m:rPr>
+            <m:sty m:val="p"/>
+          </m:rPr>
+          <m:t>×</m:t>
+        </m:r>
+        <m:sSup>
+          <m:e>
+            <m:r>
+              <m:t>10</m:t>
+            </m:r>
+          </m:e>
+          <m:sup>
+            <m:r>
+              <m:rPr>
+                <m:sty m:val="p"/>
+              </m:rPr>
+              <m:t>−</m:t>
+            </m:r>
+            <m:r>
+              <m:t>6</m:t>
+            </m:r>
+          </m:sup>
+        </m:sSup>
+      </m:oMath>
+      <w:r>
+        <w:rPr>
+          <w:rtl/>
+        </w:rPr>
+        <w:t xml:space="preserve">. (ثابت‌های فلزی‌مانندِ</w:t>
+      </w:r>
+      <w:r>
+        <w:rPr>
+          <w:rtl/>
+        </w:rPr>
+        <w:t xml:space="preserve"> </w:t>
+      </w:r>
+      <m:oMath>
+        <m:r>
+          <m:t>E</m:t>
+        </m:r>
+        <m:r>
+          <m:rPr>
+            <m:sty m:val="p"/>
+          </m:rPr>
+          <m:t>=</m:t>
+        </m:r>
+        <m:r>
+          <m:t>223</m:t>
+        </m:r>
+      </m:oMath>
+      <w:r>
+        <w:rPr>
+          <w:rtl/>
+        </w:rPr>
+        <w:t xml:space="preserve"> </w:t>
+      </w:r>
+      <w:r>
+        <w:rPr>
+          <w:rtl/>
+        </w:rPr>
+        <w:t xml:space="preserve">GPa و</w:t>
+      </w:r>
+      <w:r>
+        <w:rPr>
+          <w:rtl/>
+        </w:rPr>
+        <w:t xml:space="preserve"> </w:t>
+      </w:r>
+      <m:oMath>
+        <m:r>
+          <m:t>ρ</m:t>
+        </m:r>
+        <m:r>
+          <m:rPr>
+            <m:sty m:val="p"/>
+          </m:rPr>
+          <m:t>=</m:t>
+        </m:r>
+        <m:r>
+          <m:t>8900</m:t>
+        </m:r>
+      </m:oMath>
+      <w:r>
+        <w:rPr>
+          <w:rtl/>
+        </w:rPr>
+        <w:t xml:space="preserve"> </w:t>
+      </w:r>
+      <w:r>
+        <w:rPr>
+          <w:rtl/>
+        </w:rPr>
+        <w:t xml:space="preserve">تنها در حالتِ</w:t>
+      </w:r>
+      <w:r>
+        <w:rPr>
+          <w:rtl/>
+        </w:rPr>
+        <w:t xml:space="preserve"> </w:t>
+      </w:r>
+      <w:r>
+        <w:rPr>
+          <w:rStyle w:val="VerbatimChar"/>
+          <w:rtl/>
+        </w:rPr>
+        <w:t xml:space="preserve">material_mode='FG_powerlaw'</w:t>
+      </w:r>
+      <w:r>
+        <w:rPr>
+          <w:rtl/>
+        </w:rPr>
+        <w:t xml:space="preserve"> </w:t>
+      </w:r>
+      <w:r>
+        <w:rPr>
+          <w:rtl/>
+        </w:rPr>
+        <w:t xml:space="preserve">برای صحت‌سنجیِ مدرج تابعی به‌کار می‌روند، نه در مادهٔ</w:t>
+      </w:r>
+      <w:r>
+        <w:rPr>
+          <w:rtl/>
+        </w:rPr>
+        <w:t xml:space="preserve"> </w:t>
+      </w:r>
+      <w:r>
+        <w:rPr>
+          <w:rtl/>
+        </w:rPr>
+        <w:t xml:space="preserve">اصلیِ گرافن/اپوکسی.)</w:t>
+      </w:r>
+    </w:p>
+    <w:p>
+      <w:pPr>
+        <w:pStyle w:val="Compact"/>
+        <w:numPr>
+          <w:ilvl w:val="0"/>
+          <w:numId w:val="1001"/>
+        </w:numPr>
+        <w:bidi/>
+      </w:pPr>
+      <w:r>
+        <w:rPr>
+          <w:b/>
+          <w:bCs/>
+          <w:rtl/>
+        </w:rPr>
         <w:t xml:space="preserve">مدول مؤثر و هدایت گرافن‌دار:</w:t>
       </w:r>
       <w:r>
@@ -2595,19 +3214,31 @@
         <w:rPr>
           <w:rtl/>
         </w:rPr>
-        <w:t xml:space="preserve">الگوهای V/A فعلاً تأییدنشده‌اند و باید با الگوهای جدید فایل MZ جایگزین شوند</w:t>
-      </w:r>
-      <w:r>
-        <w:rPr>
-          <w:rtl/>
-        </w:rPr>
-        <w:t xml:space="preserve"> </w:t>
-      </w:r>
-      <w:r>
-        <w:rPr>
-          <w:rtl/>
-        </w:rPr>
-        <w:t xml:space="preserve">(Prom.2 بند ز). حالت</w:t>
+        <w:t xml:space="preserve">نهایی‌سازیِ روابطِ الگوهای تخلخل (به‌ویژه V/A) بر پایهٔ فایل MZ بر عهدهٔ نویسنده است</w:t>
+      </w:r>
+      <w:r>
+        <w:rPr>
+          <w:rtl/>
+        </w:rPr>
+        <w:t xml:space="preserve"> </w:t>
+      </w:r>
+      <w:r>
+        <w:rPr>
+          <w:rtl/>
+        </w:rPr>
+        <w:t xml:space="preserve">(Prom.2 بند ز / A7)؛ بلوکِ تخلخل تا آن زمان دست‌نخورده نگه داشته شده و از نسخهٔ R3_1</w:t>
+      </w:r>
+      <w:r>
+        <w:rPr>
+          <w:rtl/>
+        </w:rPr>
+        <w:t xml:space="preserve"> </w:t>
+      </w:r>
+      <w:r>
+        <w:rPr>
+          <w:rtl/>
+        </w:rPr>
+        <w:t xml:space="preserve">به بعد هیچ هشدارِ زمان‌اجرایی صادر نمی‌کند. حالت</w:t>
       </w:r>
       <w:r>
         <w:rPr>
@@ -2632,23 +3263,23 @@
         <w:rPr>
           <w:rtl/>
         </w:rPr>
-        <w:t xml:space="preserve">نیز برای صحت‌سنجی در برابر</w:t>
-      </w:r>
-      <w:r>
-        <w:rPr>
-          <w:rtl/>
-        </w:rPr>
-        <w:t xml:space="preserve"> </w:t>
-      </w:r>
-      <w:r>
-        <w:rPr>
-          <w:rtl/>
-        </w:rPr>
-        <w:t xml:space="preserve">مراجع مدرج تابعی فراهم است.</w:t>
+        <w:t xml:space="preserve">نیز</w:t>
+      </w:r>
+      <w:r>
+        <w:rPr>
+          <w:rtl/>
+        </w:rPr>
+        <w:t xml:space="preserve"> </w:t>
+      </w:r>
+      <w:r>
+        <w:rPr>
+          <w:rtl/>
+        </w:rPr>
+        <w:t xml:space="preserve">برای صحت‌سنجی در برابر مراجع مدرج تابعی فراهم است.</w:t>
       </w:r>
     </w:p>
     <w:bookmarkEnd w:id="13"/>
-    <w:bookmarkStart w:id="17" w:name="Xf120799786416295179efe84e33b64abfc92d72"/>
+    <w:bookmarkStart w:id="18" w:name="Xf120799786416295179efe84e33b64abfc92d72"/>
     <w:p>
       <w:pPr>
         <w:pStyle w:val="Heading2"/>
@@ -3763,7 +4394,7 @@
       </w:r>
     </w:p>
     <w:bookmarkEnd w:id="14"/>
-    <w:bookmarkStart w:id="15" w:name="ساختار-ماتریسها"/>
+    <w:bookmarkStart w:id="15" w:name="اشیای-صریح-نگاشت-افزوده-نسخه-r7"/>
     <w:p>
       <w:pPr>
         <w:pStyle w:val="Heading3"/>
@@ -3773,7 +4404,7 @@
         <w:rPr>
           <w:rtl/>
         </w:rPr>
-        <w:t xml:space="preserve">ساختار ماتریس‌ها</w:t>
+        <w:t xml:space="preserve">اشیای صریحِ نگاشت (افزودهٔ نسخهٔ R7)</w:t>
       </w:r>
     </w:p>
     <w:p>
@@ -3784,7 +4415,45 @@
         <w:rPr>
           <w:rtl/>
         </w:rPr>
-        <w:t xml:space="preserve">سه ماتریس تُنُکِ سراسری</w:t>
+        <w:t xml:space="preserve">نسخهٔ R7 همین ترتیبِ شماره‌دهی را با سه شیِ بازرسی‌پذیر</w:t>
+      </w:r>
+      <w:r>
+        <w:rPr>
+          <w:rtl/>
+        </w:rPr>
+        <w:t xml:space="preserve"> </w:t>
+      </w:r>
+      <w:r>
+        <w:rPr>
+          <w:b/>
+          <w:bCs/>
+          <w:rtl/>
+        </w:rPr>
+        <w:t xml:space="preserve">به‌طور صریح</w:t>
+      </w:r>
+      <w:r>
+        <w:rPr>
+          <w:rtl/>
+        </w:rPr>
+        <w:t xml:space="preserve"> </w:t>
+      </w:r>
+      <w:r>
+        <w:rPr>
+          <w:rtl/>
+        </w:rPr>
+        <w:t xml:space="preserve">مستند</w:t>
+      </w:r>
+      <w:r>
+        <w:rPr>
+          <w:rtl/>
+        </w:rPr>
+        <w:t xml:space="preserve"> </w:t>
+      </w:r>
+      <w:r>
+        <w:rPr>
+          <w:rtl/>
+        </w:rPr>
+        <w:t xml:space="preserve">می‌کند، بی‌آنکه هیچ فیزیکی تغییر کند؛ ماتریس‌های</w:t>
       </w:r>
       <w:r>
         <w:rPr>
@@ -3807,12 +4476,6 @@
       </w:r>
       <w:r>
         <w:rPr>
-          <w:rtl/>
-        </w:rPr>
-        <w:t xml:space="preserve"> </w:t>
-      </w:r>
-      <w:r>
-        <w:rPr>
           <w:rStyle w:val="VerbatimChar"/>
           <w:rtl/>
         </w:rPr>
@@ -3826,12 +4489,6 @@
       </w:r>
       <w:r>
         <w:rPr>
-          <w:rtl/>
-        </w:rPr>
-        <w:t xml:space="preserve"> </w:t>
-      </w:r>
-      <w:r>
-        <w:rPr>
           <w:rStyle w:val="VerbatimChar"/>
           <w:rtl/>
         </w:rPr>
@@ -3841,124 +4498,44 @@
         <w:rPr>
           <w:rtl/>
         </w:rPr>
-        <w:t xml:space="preserve"> </w:t>
-      </w:r>
-      <w:r>
-        <w:rPr>
-          <w:rtl/>
-        </w:rPr>
-        <w:t xml:space="preserve">با ابعاد</w:t>
-      </w:r>
-      <w:r>
-        <w:rPr>
-          <w:rtl/>
-        </w:rPr>
-        <w:t xml:space="preserve"> </w:t>
-      </w:r>
-      <w:r>
-        <w:rPr>
-          <w:rStyle w:val="VerbatimChar"/>
-          <w:rtl/>
-        </w:rPr>
-        <w:t xml:space="preserve">Ndof × Ndof</w:t>
-      </w:r>
-      <w:r>
-        <w:rPr>
-          <w:rtl/>
-        </w:rPr>
-        <w:t xml:space="preserve"> </w:t>
-      </w:r>
-      <w:r>
-        <w:rPr>
-          <w:rtl/>
-        </w:rPr>
-        <w:t xml:space="preserve">ساخته می‌شوند</w:t>
-      </w:r>
-      <w:r>
-        <w:rPr>
-          <w:rtl/>
-        </w:rPr>
-        <w:t xml:space="preserve"> </w:t>
-      </w:r>
-      <w:r>
-        <w:rPr>
-          <w:rtl/>
-        </w:rPr>
-        <w:t xml:space="preserve">(نه ماتریس مستطیلیِ اولیه؛ مونتاژ مستقیماً روی درجات آزادی انجام می‌شود). حلقهٔ</w:t>
-      </w:r>
-      <w:r>
-        <w:rPr>
-          <w:rtl/>
-        </w:rPr>
-        <w:t xml:space="preserve"> </w:t>
-      </w:r>
-      <w:r>
-        <w:rPr>
-          <w:rtl/>
-        </w:rPr>
-        <w:t xml:space="preserve">مونتاژ روی هر لایه و هر نقطهٔ</w:t>
-      </w:r>
-      <w:r>
-        <w:rPr>
-          <w:rtl/>
-        </w:rPr>
-        <w:t xml:space="preserve"> </w:t>
-      </w:r>
-      <m:oMath>
-        <m:r>
-          <m:rPr>
-            <m:sty m:val="p"/>
-          </m:rPr>
-          <m:t>(</m:t>
-        </m:r>
-        <m:r>
-          <m:t>i</m:t>
-        </m:r>
-        <m:r>
-          <m:t>r</m:t>
-        </m:r>
-        <m:r>
-          <m:rPr>
-            <m:sty m:val="p"/>
-          </m:rPr>
-          <m:t>,</m:t>
-        </m:r>
-        <m:r>
-          <m:t>i</m:t>
-        </m:r>
-        <m:r>
-          <m:t>z</m:t>
-        </m:r>
-        <m:r>
-          <m:rPr>
-            <m:sty m:val="p"/>
-          </m:rPr>
-          <m:t>)</m:t>
-        </m:r>
-      </m:oMath>
-      <w:r>
-        <w:rPr>
-          <w:rtl/>
-        </w:rPr>
-        <w:t xml:space="preserve"> </w:t>
-      </w:r>
-      <w:r>
-        <w:rPr>
-          <w:rtl/>
-        </w:rPr>
-        <w:t xml:space="preserve">می‌گردد و برای هر سه معادله سطر متناظر</w:t>
-      </w:r>
-      <w:r>
-        <w:rPr>
-          <w:rtl/>
-        </w:rPr>
-        <w:t xml:space="preserve"> </w:t>
-      </w:r>
-      <w:r>
-        <w:rPr>
-          <w:rtl/>
-        </w:rPr>
-        <w:t xml:space="preserve">را پر می‌کند:</w:t>
+        <w:t xml:space="preserve">، حلِ دستگاه و همهٔ</w:t>
+      </w:r>
+      <w:r>
+        <w:rPr>
+          <w:rtl/>
+        </w:rPr>
+        <w:t xml:space="preserve"> </w:t>
+      </w:r>
+      <w:r>
+        <w:rPr>
+          <w:rtl/>
+        </w:rPr>
+        <w:t xml:space="preserve">خروجی‌ها رقم‌به‌رقم با</w:t>
+      </w:r>
+      <w:r>
+        <w:rPr>
+          <w:rtl/>
+        </w:rPr>
+        <w:t xml:space="preserve"> </w:t>
+      </w:r>
+      <w:r>
+        <w:rPr>
+          <w:rStyle w:val="VerbatimChar"/>
+          <w:rtl/>
+        </w:rPr>
+        <w:t xml:space="preserve">claude_R6</w:t>
+      </w:r>
+      <w:r>
+        <w:rPr>
+          <w:rtl/>
+        </w:rPr>
+        <w:t xml:space="preserve"> </w:t>
+      </w:r>
+      <w:r>
+        <w:rPr>
+          <w:rtl/>
+        </w:rPr>
+        <w:t xml:space="preserve">یکسان می‌مانند:</w:t>
       </w:r>
     </w:p>
     <w:p>
@@ -3967,6 +4544,912 @@
         <w:numPr>
           <w:ilvl w:val="0"/>
           <w:numId w:val="1002"/>
+        </w:numPr>
+        <w:bidi/>
+      </w:pPr>
+      <w:r>
+        <w:rPr>
+          <w:rStyle w:val="VerbatimChar"/>
+          <w:rtl/>
+        </w:rPr>
+        <w:t xml:space="preserve">NodeMap(ir,iz)</w:t>
+      </w:r>
+      <w:r>
+        <w:rPr>
+          <w:rtl/>
+        </w:rPr>
+        <w:t xml:space="preserve"> </w:t>
+      </w:r>
+      <w:r>
+        <w:rPr>
+          <w:rtl/>
+        </w:rPr>
+        <w:t xml:space="preserve">— ماتریس شماره‌دهیِ گرهِ</w:t>
+      </w:r>
+      <w:r>
+        <w:rPr>
+          <w:rtl/>
+        </w:rPr>
+        <w:t xml:space="preserve"> </w:t>
+      </w:r>
+      <w:r>
+        <w:rPr>
+          <w:b/>
+          <w:bCs/>
+          <w:rtl/>
+        </w:rPr>
+        <w:t xml:space="preserve">مستطیلیِ</w:t>
+      </w:r>
+      <w:r>
+        <w:rPr>
+          <w:rtl/>
+        </w:rPr>
+        <w:t xml:space="preserve"> </w:t>
+      </w:r>
+      <w:r>
+        <w:rPr>
+          <w:rtl/>
+        </w:rPr>
+        <w:t xml:space="preserve">یک لایه با ابعاد</w:t>
+      </w:r>
+      <w:r>
+        <w:rPr>
+          <w:rtl/>
+        </w:rPr>
+        <w:t xml:space="preserve"> </w:t>
+      </w:r>
+      <m:oMath>
+        <m:sSub>
+          <m:e>
+            <m:r>
+              <m:t>N</m:t>
+            </m:r>
+          </m:e>
+          <m:sub>
+            <m:r>
+              <m:t>r</m:t>
+            </m:r>
+          </m:sub>
+        </m:sSub>
+        <m:r>
+          <m:rPr>
+            <m:sty m:val="p"/>
+          </m:rPr>
+          <m:t>×</m:t>
+        </m:r>
+        <m:sSub>
+          <m:e>
+            <m:r>
+              <m:t>N</m:t>
+            </m:r>
+          </m:e>
+          <m:sub>
+            <m:r>
+              <m:t>z</m:t>
+            </m:r>
+          </m:sub>
+        </m:sSub>
+      </m:oMath>
+      <w:r>
+        <w:rPr>
+          <w:rtl/>
+        </w:rPr>
+        <w:t xml:space="preserve">؛ در کد</w:t>
+      </w:r>
+      <w:r>
+        <w:rPr>
+          <w:rtl/>
+        </w:rPr>
+        <w:t xml:space="preserve"> </w:t>
+      </w:r>
+      <w:r>
+        <w:rPr>
+          <w:rStyle w:val="VerbatimChar"/>
+          <w:rtl/>
+        </w:rPr>
+        <w:t xml:space="preserve">NodeMap = reshape(1:N_r*N_z, N_z, N_r).'</w:t>
+      </w:r>
+      <w:r>
+        <w:rPr>
+          <w:rtl/>
+        </w:rPr>
+        <w:t xml:space="preserve"> </w:t>
+      </w:r>
+      <w:r>
+        <w:rPr>
+          <w:rtl/>
+        </w:rPr>
+        <w:t xml:space="preserve">که اندیس</w:t>
+      </w:r>
+      <w:r>
+        <w:rPr>
+          <w:rtl/>
+        </w:rPr>
+        <w:t xml:space="preserve"> </w:t>
+      </w:r>
+      <w:r>
+        <w:rPr>
+          <w:rtl/>
+        </w:rPr>
+        <w:t xml:space="preserve">محوری</w:t>
+      </w:r>
+      <w:r>
+        <w:rPr>
+          <w:rtl/>
+        </w:rPr>
+        <w:t xml:space="preserve"> </w:t>
+      </w:r>
+      <m:oMath>
+        <m:r>
+          <m:t>i</m:t>
+        </m:r>
+        <m:r>
+          <m:t>z</m:t>
+        </m:r>
+      </m:oMath>
+      <w:r>
+        <w:rPr>
+          <w:rtl/>
+        </w:rPr>
+        <w:t xml:space="preserve"> </w:t>
+      </w:r>
+      <w:r>
+        <w:rPr>
+          <w:rtl/>
+        </w:rPr>
+        <w:t xml:space="preserve">را سریع‌ترین می‌گیرد و همان شمارهٔ محلیِ</w:t>
+      </w:r>
+      <w:r>
+        <w:rPr>
+          <w:rtl/>
+        </w:rPr>
+        <w:t xml:space="preserve"> </w:t>
+      </w:r>
+      <m:oMath>
+        <m:r>
+          <m:rPr>
+            <m:sty m:val="p"/>
+          </m:rPr>
+          <m:t>(</m:t>
+        </m:r>
+        <m:r>
+          <m:t>i</m:t>
+        </m:r>
+        <m:r>
+          <m:t>r</m:t>
+        </m:r>
+        <m:r>
+          <m:rPr>
+            <m:sty m:val="p"/>
+          </m:rPr>
+          <m:t>−</m:t>
+        </m:r>
+        <m:r>
+          <m:t>1</m:t>
+        </m:r>
+        <m:r>
+          <m:rPr>
+            <m:sty m:val="p"/>
+          </m:rPr>
+          <m:t>)</m:t>
+        </m:r>
+        <m:sSub>
+          <m:e>
+            <m:r>
+              <m:t>N</m:t>
+            </m:r>
+          </m:e>
+          <m:sub>
+            <m:r>
+              <m:t>z</m:t>
+            </m:r>
+          </m:sub>
+        </m:sSub>
+        <m:r>
+          <m:rPr>
+            <m:sty m:val="p"/>
+          </m:rPr>
+          <m:t>+</m:t>
+        </m:r>
+        <m:r>
+          <m:t>i</m:t>
+        </m:r>
+        <m:r>
+          <m:t>z</m:t>
+        </m:r>
+      </m:oMath>
+      <w:r>
+        <w:rPr>
+          <w:rtl/>
+        </w:rPr>
+        <w:t xml:space="preserve"> </w:t>
+      </w:r>
+      <w:r>
+        <w:rPr>
+          <w:rtl/>
+        </w:rPr>
+        <w:t xml:space="preserve">را بازمی‌گرداند.</w:t>
+      </w:r>
+    </w:p>
+    <w:p>
+      <w:pPr>
+        <w:pStyle w:val="Compact"/>
+        <w:numPr>
+          <w:ilvl w:val="0"/>
+          <w:numId w:val="1002"/>
+        </w:numPr>
+        <w:bidi/>
+      </w:pPr>
+      <w:r>
+        <w:rPr>
+          <w:rStyle w:val="VerbatimChar"/>
+          <w:rtl/>
+        </w:rPr>
+        <w:t xml:space="preserve">DOFmap(g,:) = [gdof, comp, e, ir, iz, localnode, r, z]</w:t>
+      </w:r>
+      <w:r>
+        <w:rPr>
+          <w:rtl/>
+        </w:rPr>
+        <w:t xml:space="preserve"> </w:t>
+      </w:r>
+      <w:r>
+        <w:rPr>
+          <w:rtl/>
+        </w:rPr>
+        <w:t xml:space="preserve">— یک سطر برای هر درجهٔ</w:t>
+      </w:r>
+      <w:r>
+        <w:rPr>
+          <w:rtl/>
+        </w:rPr>
+        <w:t xml:space="preserve"> </w:t>
+      </w:r>
+      <w:r>
+        <w:rPr>
+          <w:rtl/>
+        </w:rPr>
+        <w:t xml:space="preserve">آزادیِ سراسری، دقیقاً به همان ترتیبی که معادلات به‌کار می‌برند (بلوک‌های میدانیِ</w:t>
+      </w:r>
+      <w:r>
+        <w:rPr>
+          <w:rtl/>
+        </w:rPr>
+        <w:t xml:space="preserve"> </w:t>
+      </w:r>
+      <m:oMath>
+        <m:r>
+          <m:t>θ</m:t>
+        </m:r>
+        <m:r>
+          <m:rPr>
+            <m:sty m:val="p"/>
+          </m:rPr>
+          <m:t>|</m:t>
+        </m:r>
+        <m:r>
+          <m:t>u</m:t>
+        </m:r>
+        <m:r>
+          <m:rPr>
+            <m:sty m:val="p"/>
+          </m:rPr>
+          <m:t>|</m:t>
+        </m:r>
+        <m:r>
+          <m:t>w</m:t>
+        </m:r>
+      </m:oMath>
+      <w:r>
+        <w:rPr>
+          <w:rtl/>
+        </w:rPr>
+        <w:t xml:space="preserve">، با</w:t>
+      </w:r>
+      <w:r>
+        <w:rPr>
+          <w:rtl/>
+        </w:rPr>
+        <w:t xml:space="preserve"> </w:t>
+      </w:r>
+      <w:r>
+        <w:rPr>
+          <w:rStyle w:val="VerbatimChar"/>
+          <w:rtl/>
+        </w:rPr>
+        <w:t xml:space="preserve">comp</w:t>
+      </w:r>
+      <w:r>
+        <w:rPr>
+          <w:rtl/>
+        </w:rPr>
+        <w:t xml:space="preserve"> </w:t>
+      </w:r>
+      <w:r>
+        <w:rPr>
+          <w:rtl/>
+        </w:rPr>
+        <w:t xml:space="preserve">برابر ۱، ۲ یا ۳).</w:t>
+      </w:r>
+    </w:p>
+    <w:p>
+      <w:pPr>
+        <w:pStyle w:val="Compact"/>
+        <w:numPr>
+          <w:ilvl w:val="0"/>
+          <w:numId w:val="1002"/>
+        </w:numPr>
+        <w:bidi/>
+      </w:pPr>
+      <w:r>
+        <w:rPr>
+          <w:rStyle w:val="VerbatimChar"/>
+          <w:rtl/>
+        </w:rPr>
+        <w:t xml:space="preserve">GridDOF(e,ir,iz,:) = [\theta,\,u,\,w]</w:t>
+      </w:r>
+      <w:r>
+        <w:rPr>
+          <w:rtl/>
+        </w:rPr>
+        <w:t xml:space="preserve"> </w:t>
+      </w:r>
+      <w:r>
+        <w:rPr>
+          <w:rtl/>
+        </w:rPr>
+        <w:t xml:space="preserve">— نمای شبکه‌ای: سه درجهٔ آزادیِ سراسری در</w:t>
+      </w:r>
+      <w:r>
+        <w:rPr>
+          <w:rtl/>
+        </w:rPr>
+        <w:t xml:space="preserve"> </w:t>
+      </w:r>
+      <w:r>
+        <w:rPr>
+          <w:rtl/>
+        </w:rPr>
+        <w:t xml:space="preserve">هر نقطهٔ گرهی.</w:t>
+      </w:r>
+    </w:p>
+    <w:p>
+      <w:pPr>
+        <w:bidi/>
+      </w:pPr>
+      <w:r>
+        <w:rPr>
+          <w:rtl/>
+        </w:rPr>
+        <w:t xml:space="preserve">هر سه شیء در فایل</w:t>
+      </w:r>
+      <w:r>
+        <w:rPr>
+          <w:rtl/>
+        </w:rPr>
+        <w:t xml:space="preserve"> </w:t>
+      </w:r>
+      <w:r>
+        <w:rPr>
+          <w:rStyle w:val="VerbatimChar"/>
+          <w:rtl/>
+        </w:rPr>
+        <w:t xml:space="preserve">.mat</w:t>
+      </w:r>
+      <w:r>
+        <w:rPr>
+          <w:rtl/>
+        </w:rPr>
+        <w:t xml:space="preserve"> </w:t>
+      </w:r>
+      <w:r>
+        <w:rPr>
+          <w:rtl/>
+        </w:rPr>
+        <w:t xml:space="preserve">ذخیره می‌شوند و</w:t>
+      </w:r>
+      <w:r>
+        <w:rPr>
+          <w:rtl/>
+        </w:rPr>
+        <w:t xml:space="preserve"> </w:t>
+      </w:r>
+      <w:r>
+        <w:rPr>
+          <w:rStyle w:val="VerbatimChar"/>
+          <w:rtl/>
+        </w:rPr>
+        <w:t xml:space="preserve">DOFmap</w:t>
+      </w:r>
+      <w:r>
+        <w:rPr>
+          <w:rtl/>
+        </w:rPr>
+        <w:t xml:space="preserve"> </w:t>
+      </w:r>
+      <w:r>
+        <w:rPr>
+          <w:rtl/>
+        </w:rPr>
+        <w:t xml:space="preserve">افزون‌بر آن به‌صورت فایل</w:t>
+      </w:r>
+      <w:r>
+        <w:rPr>
+          <w:rtl/>
+        </w:rPr>
+        <w:t xml:space="preserve"> </w:t>
+      </w:r>
+      <w:r>
+        <w:rPr>
+          <w:rStyle w:val="VerbatimChar"/>
+          <w:rtl/>
+        </w:rPr>
+        <w:t xml:space="preserve">&lt;out_name&gt;_DOFmap.csv</w:t>
+      </w:r>
+      <w:r>
+        <w:rPr>
+          <w:rtl/>
+        </w:rPr>
+        <w:t xml:space="preserve"> </w:t>
+      </w:r>
+      <w:r>
+        <w:rPr>
+          <w:rtl/>
+        </w:rPr>
+        <w:t xml:space="preserve">(با سرستون</w:t>
+      </w:r>
+      <w:r>
+        <w:rPr>
+          <w:rtl/>
+        </w:rPr>
+        <w:t xml:space="preserve"> </w:t>
+      </w:r>
+      <w:r>
+        <w:rPr>
+          <w:rStyle w:val="VerbatimChar"/>
+          <w:rtl/>
+        </w:rPr>
+        <w:t xml:space="preserve">gdof,component,comp_name,layer_e,ir,iz,localnode,r,z</w:t>
+      </w:r>
+      <w:r>
+        <w:rPr>
+          <w:rtl/>
+        </w:rPr>
+        <w:t xml:space="preserve">) نوشته می‌شود تا سند</w:t>
+      </w:r>
+      <w:r>
+        <w:rPr>
+          <w:rtl/>
+        </w:rPr>
+        <w:t xml:space="preserve"> </w:t>
+      </w:r>
+      <w:r>
+        <w:rPr>
+          <w:rtl/>
+        </w:rPr>
+        <w:t xml:space="preserve">مستندسازیِ کد بتواند به آن ارجاع دهد. این پاسخِ مستقیم به بازخورد Prom.2</w:t>
+      </w:r>
+      <w:r>
+        <w:rPr>
+          <w:rtl/>
+        </w:rPr>
+        <w:t xml:space="preserve"> </w:t>
+      </w:r>
+      <w:r>
+        <w:rPr>
+          <w:rtl/>
+        </w:rPr>
+        <w:t xml:space="preserve">(صفحهٔ ۴) است: سازمان‌دهیِ مستطیلیِ سختی/جرم به‌همراه یک ماتریس شماره‌دهی/نگاشتِ</w:t>
+      </w:r>
+      <w:r>
+        <w:rPr>
+          <w:rtl/>
+        </w:rPr>
+        <w:t xml:space="preserve"> </w:t>
+      </w:r>
+      <w:r>
+        <w:rPr>
+          <w:rtl/>
+        </w:rPr>
+        <w:t xml:space="preserve">درجات آزادی در ترتیبِ معادلات. برای هندسه و شبکهٔ جاریِ رساله</w:t>
+      </w:r>
+      <w:r>
+        <w:rPr>
+          <w:rtl/>
+        </w:rPr>
+        <w:t xml:space="preserve"> </w:t>
+      </w:r>
+      <w:r>
+        <w:rPr>
+          <w:rtl/>
+        </w:rPr>
+        <w:t xml:space="preserve">(</w:t>
+      </w:r>
+      <m:oMath>
+        <m:sSub>
+          <m:e>
+            <m:r>
+              <m:t>N</m:t>
+            </m:r>
+          </m:e>
+          <m:sub>
+            <m:r>
+              <m:t>L</m:t>
+            </m:r>
+          </m:sub>
+        </m:sSub>
+        <m:r>
+          <m:rPr>
+            <m:sty m:val="p"/>
+          </m:rPr>
+          <m:t>=</m:t>
+        </m:r>
+        <m:r>
+          <m:t>7</m:t>
+        </m:r>
+      </m:oMath>
+      <w:r>
+        <w:rPr>
+          <w:rtl/>
+        </w:rPr>
+        <w:t xml:space="preserve">،</w:t>
+      </w:r>
+      <w:r>
+        <w:rPr>
+          <w:rtl/>
+        </w:rPr>
+        <w:t xml:space="preserve"> </w:t>
+      </w:r>
+      <m:oMath>
+        <m:sSub>
+          <m:e>
+            <m:r>
+              <m:t>N</m:t>
+            </m:r>
+          </m:e>
+          <m:sub>
+            <m:r>
+              <m:t>r</m:t>
+            </m:r>
+          </m:sub>
+        </m:sSub>
+        <m:r>
+          <m:rPr>
+            <m:sty m:val="p"/>
+          </m:rPr>
+          <m:t>=</m:t>
+        </m:r>
+        <m:r>
+          <m:t>15</m:t>
+        </m:r>
+      </m:oMath>
+      <w:r>
+        <w:rPr>
+          <w:rtl/>
+        </w:rPr>
+        <w:t xml:space="preserve">،</w:t>
+      </w:r>
+      <w:r>
+        <w:rPr>
+          <w:rtl/>
+        </w:rPr>
+        <w:t xml:space="preserve"> </w:t>
+      </w:r>
+      <m:oMath>
+        <m:sSub>
+          <m:e>
+            <m:r>
+              <m:t>N</m:t>
+            </m:r>
+          </m:e>
+          <m:sub>
+            <m:r>
+              <m:t>z</m:t>
+            </m:r>
+          </m:sub>
+        </m:sSub>
+        <m:r>
+          <m:rPr>
+            <m:sty m:val="p"/>
+          </m:rPr>
+          <m:t>=</m:t>
+        </m:r>
+        <m:r>
+          <m:t>11</m:t>
+        </m:r>
+      </m:oMath>
+      <w:r>
+        <w:rPr>
+          <w:rtl/>
+        </w:rPr>
+        <w:t xml:space="preserve">) داریم</w:t>
+      </w:r>
+      <w:r>
+        <w:rPr>
+          <w:rtl/>
+        </w:rPr>
+        <w:t xml:space="preserve"> </w:t>
+      </w:r>
+      <m:oMath>
+        <m:sSub>
+          <m:e>
+            <m:r>
+              <m:t>N</m:t>
+            </m:r>
+          </m:e>
+          <m:sub>
+            <m:r>
+              <m:t>n</m:t>
+            </m:r>
+          </m:sub>
+        </m:sSub>
+        <m:r>
+          <m:rPr>
+            <m:sty m:val="p"/>
+          </m:rPr>
+          <m:t>=</m:t>
+        </m:r>
+        <m:r>
+          <m:t>1155</m:t>
+        </m:r>
+      </m:oMath>
+      <w:r>
+        <w:rPr>
+          <w:rtl/>
+        </w:rPr>
+        <w:t xml:space="preserve"> </w:t>
+      </w:r>
+      <w:r>
+        <w:rPr>
+          <w:rtl/>
+        </w:rPr>
+        <w:t xml:space="preserve">و</w:t>
+      </w:r>
+      <w:r>
+        <w:rPr>
+          <w:rtl/>
+        </w:rPr>
+        <w:t xml:space="preserve"> </w:t>
+      </w:r>
+      <m:oMath>
+        <m:sSub>
+          <m:e>
+            <m:r>
+              <m:t>N</m:t>
+            </m:r>
+          </m:e>
+          <m:sub>
+            <m:r>
+              <m:rPr>
+                <m:nor/>
+                <m:sty m:val="p"/>
+              </m:rPr>
+              <m:t>dof</m:t>
+            </m:r>
+          </m:sub>
+        </m:sSub>
+        <m:r>
+          <m:rPr>
+            <m:sty m:val="p"/>
+          </m:rPr>
+          <m:t>=</m:t>
+        </m:r>
+        <m:r>
+          <m:t>3465</m:t>
+        </m:r>
+      </m:oMath>
+      <w:r>
+        <w:rPr>
+          <w:rtl/>
+        </w:rPr>
+        <w:t xml:space="preserve">.</w:t>
+      </w:r>
+    </w:p>
+    <w:bookmarkEnd w:id="15"/>
+    <w:bookmarkStart w:id="16" w:name="ساختار-ماتریسها"/>
+    <w:p>
+      <w:pPr>
+        <w:pStyle w:val="Heading3"/>
+        <w:bidi/>
+      </w:pPr>
+      <w:r>
+        <w:rPr>
+          <w:rtl/>
+        </w:rPr>
+        <w:t xml:space="preserve">ساختار ماتریس‌ها</w:t>
+      </w:r>
+    </w:p>
+    <w:p>
+      <w:pPr>
+        <w:bidi/>
+      </w:pPr>
+      <w:r>
+        <w:rPr>
+          <w:rtl/>
+        </w:rPr>
+        <w:t xml:space="preserve">سه ماتریس تُنُکِ سراسری</w:t>
+      </w:r>
+      <w:r>
+        <w:rPr>
+          <w:rtl/>
+        </w:rPr>
+        <w:t xml:space="preserve"> </w:t>
+      </w:r>
+      <w:r>
+        <w:rPr>
+          <w:rStyle w:val="VerbatimChar"/>
+          <w:rtl/>
+        </w:rPr>
+        <w:t xml:space="preserve">M</w:t>
+      </w:r>
+      <w:r>
+        <w:rPr>
+          <w:rtl/>
+        </w:rPr>
+        <w:t xml:space="preserve">,</w:t>
+      </w:r>
+      <w:r>
+        <w:rPr>
+          <w:rtl/>
+        </w:rPr>
+        <w:t xml:space="preserve"> </w:t>
+      </w:r>
+      <w:r>
+        <w:rPr>
+          <w:rStyle w:val="VerbatimChar"/>
+          <w:rtl/>
+        </w:rPr>
+        <w:t xml:space="preserve">C</w:t>
+      </w:r>
+      <w:r>
+        <w:rPr>
+          <w:rtl/>
+        </w:rPr>
+        <w:t xml:space="preserve">,</w:t>
+      </w:r>
+      <w:r>
+        <w:rPr>
+          <w:rtl/>
+        </w:rPr>
+        <w:t xml:space="preserve"> </w:t>
+      </w:r>
+      <w:r>
+        <w:rPr>
+          <w:rStyle w:val="VerbatimChar"/>
+          <w:rtl/>
+        </w:rPr>
+        <w:t xml:space="preserve">K</w:t>
+      </w:r>
+      <w:r>
+        <w:rPr>
+          <w:rtl/>
+        </w:rPr>
+        <w:t xml:space="preserve"> </w:t>
+      </w:r>
+      <w:r>
+        <w:rPr>
+          <w:rtl/>
+        </w:rPr>
+        <w:t xml:space="preserve">با ابعاد</w:t>
+      </w:r>
+      <w:r>
+        <w:rPr>
+          <w:rtl/>
+        </w:rPr>
+        <w:t xml:space="preserve"> </w:t>
+      </w:r>
+      <w:r>
+        <w:rPr>
+          <w:rStyle w:val="VerbatimChar"/>
+          <w:rtl/>
+        </w:rPr>
+        <w:t xml:space="preserve">Ndof × Ndof</w:t>
+      </w:r>
+      <w:r>
+        <w:rPr>
+          <w:rtl/>
+        </w:rPr>
+        <w:t xml:space="preserve"> </w:t>
+      </w:r>
+      <w:r>
+        <w:rPr>
+          <w:rtl/>
+        </w:rPr>
+        <w:t xml:space="preserve">ساخته می‌شوند</w:t>
+      </w:r>
+      <w:r>
+        <w:rPr>
+          <w:rtl/>
+        </w:rPr>
+        <w:t xml:space="preserve"> </w:t>
+      </w:r>
+      <w:r>
+        <w:rPr>
+          <w:rtl/>
+        </w:rPr>
+        <w:t xml:space="preserve">(نه ماتریس مستطیلیِ اولیه؛ مونتاژ مستقیماً روی درجات آزادی انجام می‌شود). حلقهٔ</w:t>
+      </w:r>
+      <w:r>
+        <w:rPr>
+          <w:rtl/>
+        </w:rPr>
+        <w:t xml:space="preserve"> </w:t>
+      </w:r>
+      <w:r>
+        <w:rPr>
+          <w:rtl/>
+        </w:rPr>
+        <w:t xml:space="preserve">مونتاژ روی هر لایه و هر نقطهٔ</w:t>
+      </w:r>
+      <w:r>
+        <w:rPr>
+          <w:rtl/>
+        </w:rPr>
+        <w:t xml:space="preserve"> </w:t>
+      </w:r>
+      <m:oMath>
+        <m:r>
+          <m:rPr>
+            <m:sty m:val="p"/>
+          </m:rPr>
+          <m:t>(</m:t>
+        </m:r>
+        <m:r>
+          <m:t>i</m:t>
+        </m:r>
+        <m:r>
+          <m:t>r</m:t>
+        </m:r>
+        <m:r>
+          <m:rPr>
+            <m:sty m:val="p"/>
+          </m:rPr>
+          <m:t>,</m:t>
+        </m:r>
+        <m:r>
+          <m:t>i</m:t>
+        </m:r>
+        <m:r>
+          <m:t>z</m:t>
+        </m:r>
+        <m:r>
+          <m:rPr>
+            <m:sty m:val="p"/>
+          </m:rPr>
+          <m:t>)</m:t>
+        </m:r>
+      </m:oMath>
+      <w:r>
+        <w:rPr>
+          <w:rtl/>
+        </w:rPr>
+        <w:t xml:space="preserve"> </w:t>
+      </w:r>
+      <w:r>
+        <w:rPr>
+          <w:rtl/>
+        </w:rPr>
+        <w:t xml:space="preserve">می‌گردد و برای هر سه معادله سطر متناظر</w:t>
+      </w:r>
+      <w:r>
+        <w:rPr>
+          <w:rtl/>
+        </w:rPr>
+        <w:t xml:space="preserve"> </w:t>
+      </w:r>
+      <w:r>
+        <w:rPr>
+          <w:rtl/>
+        </w:rPr>
+        <w:t xml:space="preserve">را پر می‌کند:</w:t>
+      </w:r>
+    </w:p>
+    <w:p>
+      <w:pPr>
+        <w:pStyle w:val="Compact"/>
+        <w:numPr>
+          <w:ilvl w:val="0"/>
+          <w:numId w:val="1003"/>
         </w:numPr>
         <w:bidi/>
       </w:pPr>
@@ -4455,7 +5938,7 @@
         <w:pStyle w:val="Compact"/>
         <w:numPr>
           <w:ilvl w:val="0"/>
-          <w:numId w:val="1002"/>
+          <w:numId w:val="1003"/>
         </w:numPr>
         <w:bidi/>
       </w:pPr>
@@ -4892,8 +6375,8 @@
         <w:t xml:space="preserve">).</w:t>
       </w:r>
     </w:p>
-    <w:bookmarkEnd w:id="15"/>
-    <w:bookmarkStart w:id="16" w:name="شرایط-مرزی"/>
+    <w:bookmarkEnd w:id="16"/>
+    <w:bookmarkStart w:id="17" w:name="شرایط-مرزی"/>
     <w:p>
       <w:pPr>
         <w:pStyle w:val="Heading3"/>
@@ -5070,9 +6553,9 @@
         <w:t xml:space="preserve">جلوگیری از حرکت صلبِ محوری صفر می‌شود.</w:t>
       </w:r>
     </w:p>
-    <w:bookmarkEnd w:id="16"/>
     <w:bookmarkEnd w:id="17"/>
-    <w:bookmarkStart w:id="18" w:name="بخش-۵-همترازی-سطری-و-تجزیه"/>
+    <w:bookmarkEnd w:id="18"/>
+    <w:bookmarkStart w:id="19" w:name="بخش-۵-همترازی-سطری-و-تجزیه"/>
     <w:p>
       <w:pPr>
         <w:pStyle w:val="Heading2"/>
@@ -5302,8 +6785,8 @@
         <w:t xml:space="preserve">) نیز پیش از حلقهٔ زمانی انجام می‌گیرد.</w:t>
       </w:r>
     </w:p>
-    <w:bookmarkEnd w:id="18"/>
-    <w:bookmarkStart w:id="19" w:name="بخش-۶-حلقه-زمانی-نیومارک"/>
+    <w:bookmarkEnd w:id="19"/>
+    <w:bookmarkStart w:id="20" w:name="بخش-۶-حلقه-زمانی-نیومارک"/>
     <w:p>
       <w:pPr>
         <w:pStyle w:val="Heading2"/>
@@ -5520,8 +7003,8 @@
         <w:t xml:space="preserve">شناسایی و متوقف می‌شود.</w:t>
       </w:r>
     </w:p>
-    <w:bookmarkEnd w:id="19"/>
-    <w:bookmarkStart w:id="20" w:name="بخش-۷-پسپردازش"/>
+    <w:bookmarkEnd w:id="20"/>
+    <w:bookmarkStart w:id="21" w:name="بخش-۷-پسپردازش"/>
     <w:p>
       <w:pPr>
         <w:pStyle w:val="Heading2"/>
@@ -5583,8 +7066,8 @@
         <w:t xml:space="preserve">, σ*, ξ) در همین مرحله ساخته می‌شوند.</w:t>
       </w:r>
     </w:p>
-    <w:bookmarkEnd w:id="20"/>
-    <w:bookmarkStart w:id="21" w:name="توابع-کمکی"/>
+    <w:bookmarkEnd w:id="21"/>
+    <w:bookmarkStart w:id="22" w:name="توابع-کمکی"/>
     <w:p>
       <w:pPr>
         <w:pStyle w:val="Heading2"/>
@@ -5602,7 +7085,7 @@
         <w:pStyle w:val="Compact"/>
         <w:numPr>
           <w:ilvl w:val="0"/>
-          <w:numId w:val="1003"/>
+          <w:numId w:val="1004"/>
         </w:numPr>
         <w:bidi/>
       </w:pPr>
@@ -5692,7 +7175,7 @@
         <w:pStyle w:val="Compact"/>
         <w:numPr>
           <w:ilvl w:val="0"/>
-          <w:numId w:val="1003"/>
+          <w:numId w:val="1004"/>
         </w:numPr>
         <w:bidi/>
       </w:pPr>
@@ -5728,8 +7211,8 @@
         <w:t xml:space="preserve">کوادریچر برای مجموعه‌نقاط داده‌شده (بر پایهٔ چندجمله‌ای‌های لاگرانژ).</w:t>
       </w:r>
     </w:p>
-    <w:bookmarkEnd w:id="21"/>
-    <w:bookmarkStart w:id="22" w:name="صحتسنجی-و-ردگیری"/>
+    <w:bookmarkEnd w:id="22"/>
+    <w:bookmarkStart w:id="23" w:name="صحتسنجی-و-ردگیری"/>
     <w:p>
       <w:pPr>
         <w:pStyle w:val="Heading2"/>
@@ -5852,8 +7335,8 @@
         <w:t xml:space="preserve">بازتولید کند؛ کد صحت‌سنجی‌شده هرگز درجا ویرایش نمی‌شود.</w:t>
       </w:r>
     </w:p>
-    <w:bookmarkEnd w:id="22"/>
     <w:bookmarkEnd w:id="23"/>
+    <w:bookmarkEnd w:id="24"/>
     <w:sectPr>
       <w:footnotePr>
         <w:numRestart w:val="eachSect"/>
@@ -6077,6 +7560,9 @@
     <w:abstractNumId w:val="991"/>
   </w:num>
   <w:num w:numId="1003">
+    <w:abstractNumId w:val="991"/>
+  </w:num>
+  <w:num w:numId="1004">
     <w:abstractNumId w:val="991"/>
   </w:num>
 </w:numbering>

</xml_diff>

<commit_message>
Sync documentation with recent changes: REVISIONS.md, code_docs, THESIS_TODO, DECISIONS_NEEDED
REVISIONS.md was the most stale: section 4 still said Ch4 R4.4 was in progress
(items 4-9 done weeks ago), section 5 deliverables table dated from before
Chapters 1-3, Appendix B, and most governance docs existed. Full refresh:
section 4 marked R4.4 complete, section 5 rebuilt with every current
deliverable, section 3 documents the plotting-rule sweep and the run() path
bug fix, section 7 commit timeline extended through the R9 add.

code_docs/CODE_DOC_usage_FA.md and technical_FA.md: added an R9 mention.

governance/THESIS_TODO.md and DECISIONS_NEEDED.md were both dated 2026-07-27
and described the old geometry and a mostly-superseded task list, rewritten
to reflect actual current status.

Co-Authored-By: Claude Sonnet 5 <noreply@anthropic.com>
</commit_message>
<xml_diff>
--- a/claude/code_docs/CODE_DOC_technical_FA.docx
+++ b/claude/code_docs/CODE_DOC_technical_FA.docx
@@ -96,7 +96,99 @@
         <w:rPr>
           <w:rtl/>
         </w:rPr>
-        <w:t xml:space="preserve">اشیای صریحِ شماره‌دهی/نگاشتِ درجات آزادی را افزوده بود (بخش ۶). برای اجرای عملی به سند</w:t>
+        <w:t xml:space="preserve">اشیای صریحِ شماره‌دهی/نگاشتِ درجات آزادی را افزوده بود (بخش ۶). یک نسخهٔ کارایی</w:t>
+      </w:r>
+      <w:r>
+        <w:rPr>
+          <w:rtl/>
+        </w:rPr>
+        <w:t xml:space="preserve"> </w:t>
+      </w:r>
+      <w:r>
+        <w:rPr>
+          <w:rtl/>
+        </w:rPr>
+        <w:t xml:space="preserve">اختیاری،</w:t>
+      </w:r>
+      <w:r>
+        <w:rPr>
+          <w:rtl/>
+        </w:rPr>
+        <w:t xml:space="preserve"> </w:t>
+      </w:r>
+      <w:r>
+        <w:rPr>
+          <w:rStyle w:val="VerbatimChar"/>
+          <w:rtl/>
+        </w:rPr>
+        <w:t xml:space="preserve">claude_R9.m</w:t>
+      </w:r>
+      <w:r>
+        <w:rPr>
+          <w:rtl/>
+        </w:rPr>
+        <w:t xml:space="preserve">، نیز موجود است: تنها بخشِ مونتاژِ حلقهٔ داخلی (بخشِ ۴-۱)</w:t>
+      </w:r>
+      <w:r>
+        <w:rPr>
+          <w:rtl/>
+        </w:rPr>
+        <w:t xml:space="preserve"> </w:t>
+      </w:r>
+      <w:r>
+        <w:rPr>
+          <w:rtl/>
+        </w:rPr>
+        <w:t xml:space="preserve">برداری‌سازی شده (نوشتن‌های تُنُکِ تک‌به‌تک با نوشتن‌های سطریِ دسته‌ای یا</w:t>
+      </w:r>
+      <w:r>
+        <w:rPr>
+          <w:rtl/>
+        </w:rPr>
+        <w:t xml:space="preserve"> </w:t>
+      </w:r>
+      <w:r>
+        <w:rPr>
+          <w:rStyle w:val="VerbatimChar"/>
+          <w:rtl/>
+        </w:rPr>
+        <w:t xml:space="preserve">kron</w:t>
+      </w:r>
+      <w:r>
+        <w:rPr>
+          <w:rtl/>
+        </w:rPr>
+        <w:t xml:space="preserve"> </w:t>
+      </w:r>
+      <w:r>
+        <w:rPr>
+          <w:rtl/>
+        </w:rPr>
+        <w:t xml:space="preserve">جایگزین شده‌اند)، بخشِ شرایطِ مرزی و فصلِ‌مشترک عیناً از R8 کپی شده، و صحت‌سنجی</w:t>
+      </w:r>
+      <w:r>
+        <w:rPr>
+          <w:rtl/>
+        </w:rPr>
+        <w:t xml:space="preserve"> </w:t>
+      </w:r>
+      <w:r>
+        <w:rPr>
+          <w:rtl/>
+        </w:rPr>
+        <w:t xml:space="preserve">نشان داده که نتایج تا دقتِ خطای گردکردنِ اعشارِ مضاعف با R8 یکسان‌اند (حدود</w:t>
+      </w:r>
+      <w:r>
+        <w:rPr>
+          <w:rtl/>
+        </w:rPr>
+        <w:t xml:space="preserve"> </w:t>
+      </w:r>
+      <w:r>
+        <w:rPr>
+          <w:rtl/>
+        </w:rPr>
+        <w:t xml:space="preserve">۲٫۱ برابر سریع‌تر در مجموع). R8 هنوز نسخهٔ رسمیِ رساله است. برای اجرای عملی به سند</w:t>
       </w:r>
       <w:r>
         <w:rPr>

</xml_diff>